<commit_message>
feat: add project architecture diagram and standalone presentation slide deck
</commit_message>
<xml_diff>
--- a/IEEE_Report.docx
+++ b/IEEE_Report.docx
@@ -577,7 +577,47 @@
     </w:p>
     <w:p>
       <w:pPr>
-        <w:spacing w:before="120" w:after="120" w:line="276" w:lineRule="auto"/>
+        <w:spacing w:before="120" w:after="120"/>
+        <w:jc w:val="center"/>
+      </w:pPr>
+      <w:r>
+        <w:drawing>
+          <wp:inline xmlns:a="http://schemas.openxmlformats.org/drawingml/2006/main" xmlns:pic="http://schemas.openxmlformats.org/drawingml/2006/picture">
+            <wp:extent cx="5486400" cy="5486400"/>
+            <wp:docPr id="1" name="Picture 1"/>
+            <wp:cNvGraphicFramePr>
+              <a:graphicFrameLocks noChangeAspect="1"/>
+            </wp:cNvGraphicFramePr>
+            <a:graphic>
+              <a:graphicData uri="http://schemas.openxmlformats.org/drawingml/2006/picture">
+                <pic:pic>
+                  <pic:nvPicPr>
+                    <pic:cNvPr id="0" name="system_architecture_diagram.png"/>
+                    <pic:cNvPicPr/>
+                  </pic:nvPicPr>
+                  <pic:blipFill>
+                    <a:blip r:embed="rId9"/>
+                    <a:stretch>
+                      <a:fillRect/>
+                    </a:stretch>
+                  </pic:blipFill>
+                  <pic:spPr>
+                    <a:xfrm>
+                      <a:off x="0" y="0"/>
+                      <a:ext cx="5486400" cy="5486400"/>
+                    </a:xfrm>
+                    <a:prstGeom prst="rect"/>
+                  </pic:spPr>
+                </pic:pic>
+              </a:graphicData>
+            </a:graphic>
+          </wp:inline>
+        </w:drawing>
+      </w:r>
+    </w:p>
+    <w:p>
+      <w:pPr>
+        <w:spacing w:before="60" w:after="240" w:line="276" w:lineRule="auto"/>
         <w:jc w:val="center"/>
       </w:pPr>
       <w:r>
@@ -587,7 +627,7 @@
           <w:i/>
           <w:sz w:val="18"/>
         </w:rPr>
-        <w:t>[Fig. 1. System architecture — see text for 7-phase pipeline description]</w:t>
+        <w:t>Fig. 1. System architecture of the 7-phase pipeline.</w:t>
       </w:r>
     </w:p>
     <w:p>

</xml_diff>

<commit_message>
docs: update project documentation to reference the benchmark ViEcomRec dataset
</commit_message>
<xml_diff>
--- a/IEEE_Report.docx
+++ b/IEEE_Report.docx
@@ -341,7 +341,7 @@
           <w:i w:val="0"/>
           <w:sz w:val="20"/>
         </w:rPr>
-        <w:t>The system is evaluated on real-world data from Tiki, one of the largest e-commerce platforms in Vietnam, encompassing 369,099 transaction reviews across 304,708 unique customers and 2,244 skincare products.</w:t>
+        <w:t>The system is evaluated on the benchmark ViEcomRec dataset, a real-world Vietnamese e-commerce dataset compiled from Tiki, encompassing 369,099 transaction reviews across 304,708 unique customers and 2,244 skincare products.</w:t>
       </w:r>
     </w:p>
     <w:p>
@@ -681,7 +681,7 @@
           <w:i w:val="0"/>
           <w:sz w:val="20"/>
         </w:rPr>
-        <w:t xml:space="preserve"> The system processes four raw CSV datasets from Tiki: (1) </w:t>
+        <w:t xml:space="preserve"> The system processes four raw CSV files from the benchmark ViEcomRec dataset (which is compiled from Tiki): (1) </w:t>
       </w:r>
       <w:r>
         <w:rPr>

</xml_diff>

<commit_message>
refactor: replace TF-IDF with SentenceTransformer for product embeddings and update SA-RFM documentation and methodology analysis
</commit_message>
<xml_diff>
--- a/IEEE_Report.docx
+++ b/IEEE_Report.docx
@@ -3132,75 +3132,7 @@
           <w:i w:val="0"/>
           <w:sz w:val="20"/>
         </w:rPr>
-        <w:t xml:space="preserve"> All textual product attributes (name, brand, type, skin type, description, ingredient, feature) are concatenated into a single document per product. Two encoding modes are supported:</w:t>
-      </w:r>
-    </w:p>
-    <w:p>
-      <w:pPr>
-        <w:spacing w:before="40" w:after="40" w:line="276" w:lineRule="auto"/>
-        <w:ind w:left="283"/>
-        <w:jc w:val="both"/>
-      </w:pPr>
-      <w:r>
-        <w:rPr>
-          <w:rFonts w:ascii="Times New Roman" w:hAnsi="Times New Roman" w:eastAsia="Times New Roman"/>
-          <w:b w:val="0"/>
-          <w:i w:val="0"/>
-          <w:sz w:val="20"/>
-        </w:rPr>
-        <w:t xml:space="preserve">  • </w:t>
-      </w:r>
-      <w:r>
-        <w:rPr>
-          <w:rFonts w:ascii="Times New Roman" w:hAnsi="Times New Roman" w:eastAsia="Times New Roman"/>
-          <w:b/>
-          <w:i w:val="0"/>
-          <w:sz w:val="20"/>
-        </w:rPr>
-        <w:t>Fallback mode (TF-IDF + LSA):</w:t>
-      </w:r>
-      <w:r>
-        <w:rPr>
-          <w:rFonts w:ascii="Times New Roman" w:hAnsi="Times New Roman" w:eastAsia="Times New Roman"/>
-          <w:b w:val="0"/>
-          <w:i w:val="0"/>
-          <w:sz w:val="20"/>
-        </w:rPr>
-        <w:t xml:space="preserve"> A TF-IDF vectorizer with 5,000 features and bigram support, followed by Truncated SVD to 128 dimensions.</w:t>
-      </w:r>
-    </w:p>
-    <w:p>
-      <w:pPr>
-        <w:spacing w:before="40" w:after="40" w:line="276" w:lineRule="auto"/>
-        <w:ind w:left="283"/>
-        <w:jc w:val="both"/>
-      </w:pPr>
-      <w:r>
-        <w:rPr>
-          <w:rFonts w:ascii="Times New Roman" w:hAnsi="Times New Roman" w:eastAsia="Times New Roman"/>
-          <w:b w:val="0"/>
-          <w:i w:val="0"/>
-          <w:sz w:val="20"/>
-        </w:rPr>
-        <w:t xml:space="preserve">  • </w:t>
-      </w:r>
-      <w:r>
-        <w:rPr>
-          <w:rFonts w:ascii="Times New Roman" w:hAnsi="Times New Roman" w:eastAsia="Times New Roman"/>
-          <w:b/>
-          <w:i w:val="0"/>
-          <w:sz w:val="20"/>
-        </w:rPr>
-        <w:t>Enhanced mode (SentenceTransformer):</w:t>
-      </w:r>
-      <w:r>
-        <w:rPr>
-          <w:rFonts w:ascii="Times New Roman" w:hAnsi="Times New Roman" w:eastAsia="Times New Roman"/>
-          <w:b w:val="0"/>
-          <w:i w:val="0"/>
-          <w:sz w:val="20"/>
-        </w:rPr>
-        <w:t xml:space="preserve"> The </w:t>
+        <w:t xml:space="preserve"> All textual product attributes (name, brand, type, skin type, description, ingredient, feature) are concatenated into a single document per product. The text embedding is generated using the pre-trained </w:t>
       </w:r>
       <w:r>
         <w:rPr>
@@ -3218,7 +3150,7 @@
           <w:i w:val="0"/>
           <w:sz w:val="20"/>
         </w:rPr>
-        <w:t xml:space="preserve"> model encodes product descriptions into 384-dimensional vectors, reduced to 128 via PCA.</w:t>
+        <w:t xml:space="preserve"> model from the SentenceTransformers library, which encodes the product documents into 384-dimensional dense semantic vectors. These are subsequently reduced to 128 dimensions via PCA.</w:t>
       </w:r>
     </w:p>
     <w:p>

</xml_diff>

<commit_message>
feat: add recommendation engine interactive testing tool and update IEEE report metadata
</commit_message>
<xml_diff>
--- a/IEEE_Report.docx
+++ b/IEEE_Report.docx
@@ -15,6 +15,21 @@
           <w:sz w:val="28"/>
         </w:rPr>
         <w:t>Multimodal Data Mining: Combining Unstructured Data and Market Basket Analysis Based on the RFM Model in E-Commerce</w:t>
+      </w:r>
+    </w:p>
+    <w:p>
+      <w:pPr>
+        <w:spacing w:before="120" w:after="360" w:line="276" w:lineRule="auto"/>
+        <w:jc w:val="center"/>
+      </w:pPr>
+      <w:r>
+        <w:rPr>
+          <w:rFonts w:ascii="Times New Roman" w:hAnsi="Times New Roman"/>
+          <w:b w:val="0"/>
+          <w:i w:val="0"/>
+          <w:sz w:val="22"/>
+        </w:rPr>
+        <w:t>Chu Minh Quan, Tran Trong Chinh, Tran Manh Tung, Nguyen Tran Kien, Tran Kim Quang</w:t>
       </w:r>
     </w:p>
     <w:p>

</xml_diff>